<commit_message>
pkg: switch to Apollo-style ppu_rules built-in flow
Replaced custom scetool-based signing with PSL1GHT's built-in
%.pkg: %.self rule from ppu_rules. The custom scetool path produced
installable .pkgs that wouldn't launch (grey/black/grey/XMB), while
the built-in rule uses make_self_npdrm + package_finalize and
produces both .pkg and .gnpdrm.pkg outputs that install AND launch
on Cobra-based CFW.

Build requires PATH to include the geohot tools dir:
  PATH="$PATH:$HOME/ps3toolchain/PSL1GHT/tools/geohot" make pkg

Reference: Apollo Save Tool (bucanero/apollo-ps3) uses the same
ppu_rules pattern unmodified.

Also includes SYS_PROCESS_PARAM bump to 0x8000000 in main.cpp from
earlier troubleshooting (kept since the larger container is more
appropriate for a media player anyway).
</commit_message>
<xml_diff>
--- a/jellyfin_ps3_todo.docx
+++ b/jellyfin_ps3_todo.docx
@@ -33,7 +33,7 @@
         <w:pStyle w:val="ListParagraph"/>
         <w:numPr>
           <w:ilvl w:val="0"/>
-          <w:numId w:val="3"/>
+          <w:numId w:val="4"/>
         </w:numPr>
         <w:spacing w:before="0" w:after="80"/>
         <w:rPr/>
@@ -48,7 +48,7 @@
         <w:pStyle w:val="ListParagraph"/>
         <w:numPr>
           <w:ilvl w:val="0"/>
-          <w:numId w:val="1"/>
+          <w:numId w:val="2"/>
         </w:numPr>
         <w:spacing w:before="0" w:after="80"/>
         <w:rPr/>
@@ -63,7 +63,7 @@
         <w:pStyle w:val="ListParagraph"/>
         <w:numPr>
           <w:ilvl w:val="0"/>
-          <w:numId w:val="1"/>
+          <w:numId w:val="2"/>
         </w:numPr>
         <w:spacing w:before="0" w:after="80"/>
         <w:rPr/>
@@ -88,7 +88,7 @@
         <w:pStyle w:val="ListParagraph"/>
         <w:numPr>
           <w:ilvl w:val="0"/>
-          <w:numId w:val="1"/>
+          <w:numId w:val="2"/>
         </w:numPr>
         <w:spacing w:before="0" w:after="80"/>
         <w:rPr/>
@@ -103,22 +103,7 @@
         <w:pStyle w:val="ListParagraph"/>
         <w:numPr>
           <w:ilvl w:val="0"/>
-          <w:numId w:val="1"/>
-        </w:numPr>
-        <w:spacing w:before="0" w:after="80"/>
-        <w:rPr/>
-      </w:pPr>
-      <w:r>
-        <w:rPr/>
-        <w:t>Search is not working.</w:t>
-      </w:r>
-    </w:p>
-    <w:p>
-      <w:pPr>
-        <w:pStyle w:val="ListParagraph"/>
-        <w:numPr>
-          <w:ilvl w:val="0"/>
-          <w:numId w:val="1"/>
+          <w:numId w:val="2"/>
         </w:numPr>
         <w:spacing w:before="0" w:after="80"/>
         <w:rPr/>
@@ -133,7 +118,7 @@
         <w:pStyle w:val="ListParagraph"/>
         <w:numPr>
           <w:ilvl w:val="0"/>
-          <w:numId w:val="1"/>
+          <w:numId w:val="2"/>
         </w:numPr>
         <w:spacing w:before="0" w:after="80"/>
         <w:rPr/>
@@ -148,7 +133,7 @@
         <w:pStyle w:val="ListParagraph"/>
         <w:numPr>
           <w:ilvl w:val="0"/>
-          <w:numId w:val="1"/>
+          <w:numId w:val="2"/>
         </w:numPr>
         <w:spacing w:before="0" w:after="80"/>
         <w:rPr/>
@@ -163,7 +148,7 @@
         <w:pStyle w:val="ListParagraph"/>
         <w:numPr>
           <w:ilvl w:val="0"/>
-          <w:numId w:val="1"/>
+          <w:numId w:val="2"/>
         </w:numPr>
         <w:spacing w:before="0" w:after="80"/>
         <w:rPr/>
@@ -178,7 +163,7 @@
         <w:pStyle w:val="ListParagraph"/>
         <w:numPr>
           <w:ilvl w:val="0"/>
-          <w:numId w:val="1"/>
+          <w:numId w:val="2"/>
         </w:numPr>
         <w:spacing w:before="0" w:after="80"/>
         <w:rPr/>
@@ -193,7 +178,7 @@
         <w:pStyle w:val="ListParagraph"/>
         <w:numPr>
           <w:ilvl w:val="0"/>
-          <w:numId w:val="1"/>
+          <w:numId w:val="2"/>
         </w:numPr>
         <w:spacing w:before="0" w:after="80"/>
         <w:rPr/>
@@ -208,7 +193,7 @@
         <w:pStyle w:val="ListParagraph"/>
         <w:numPr>
           <w:ilvl w:val="0"/>
-          <w:numId w:val="1"/>
+          <w:numId w:val="2"/>
         </w:numPr>
         <w:spacing w:before="0" w:after="80"/>
         <w:rPr/>
@@ -233,22 +218,7 @@
         <w:pStyle w:val="ListParagraph"/>
         <w:numPr>
           <w:ilvl w:val="0"/>
-          <w:numId w:val="1"/>
-        </w:numPr>
-        <w:spacing w:before="0" w:after="80"/>
-        <w:rPr/>
-      </w:pPr>
-      <w:r>
-        <w:rPr/>
-        <w:t>Media tiles are too wide in the GUI — fix before the next release.</w:t>
-      </w:r>
-    </w:p>
-    <w:p>
-      <w:pPr>
-        <w:pStyle w:val="ListParagraph"/>
-        <w:numPr>
-          <w:ilvl w:val="0"/>
-          <w:numId w:val="1"/>
+          <w:numId w:val="2"/>
         </w:numPr>
         <w:spacing w:before="0" w:after="80"/>
         <w:rPr/>
@@ -273,7 +243,7 @@
         <w:pStyle w:val="ListParagraph"/>
         <w:numPr>
           <w:ilvl w:val="0"/>
-          <w:numId w:val="1"/>
+          <w:numId w:val="2"/>
         </w:numPr>
         <w:spacing w:before="0" w:after="80"/>
         <w:rPr/>
@@ -298,7 +268,7 @@
         <w:pStyle w:val="ListParagraph"/>
         <w:numPr>
           <w:ilvl w:val="0"/>
-          <w:numId w:val="1"/>
+          <w:numId w:val="2"/>
         </w:numPr>
         <w:spacing w:before="0" w:after="80"/>
         <w:rPr/>
@@ -313,7 +283,7 @@
         <w:pStyle w:val="ListParagraph"/>
         <w:numPr>
           <w:ilvl w:val="0"/>
-          <w:numId w:val="1"/>
+          <w:numId w:val="2"/>
         </w:numPr>
         <w:spacing w:before="0" w:after="80"/>
         <w:rPr/>
@@ -365,6 +335,7 @@
         </w:tabs>
         <w:ind w:start="1080" w:hanging="360"/>
       </w:pPr>
+      <w:rPr/>
     </w:lvl>
     <w:lvl w:ilvl="2">
       <w:start w:val="1"/>
@@ -377,6 +348,7 @@
         </w:tabs>
         <w:ind w:start="1440" w:hanging="360"/>
       </w:pPr>
+      <w:rPr/>
     </w:lvl>
     <w:lvl w:ilvl="3">
       <w:start w:val="1"/>
@@ -389,6 +361,7 @@
         </w:tabs>
         <w:ind w:start="1800" w:hanging="360"/>
       </w:pPr>
+      <w:rPr/>
     </w:lvl>
     <w:lvl w:ilvl="4">
       <w:start w:val="1"/>
@@ -401,6 +374,7 @@
         </w:tabs>
         <w:ind w:start="2160" w:hanging="360"/>
       </w:pPr>
+      <w:rPr/>
     </w:lvl>
     <w:lvl w:ilvl="5">
       <w:start w:val="1"/>
@@ -413,6 +387,7 @@
         </w:tabs>
         <w:ind w:start="2520" w:hanging="360"/>
       </w:pPr>
+      <w:rPr/>
     </w:lvl>
     <w:lvl w:ilvl="6">
       <w:start w:val="1"/>
@@ -425,6 +400,7 @@
         </w:tabs>
         <w:ind w:start="2880" w:hanging="360"/>
       </w:pPr>
+      <w:rPr/>
     </w:lvl>
     <w:lvl w:ilvl="7">
       <w:start w:val="1"/>
@@ -437,6 +413,7 @@
         </w:tabs>
         <w:ind w:start="3240" w:hanging="360"/>
       </w:pPr>
+      <w:rPr/>
     </w:lvl>
     <w:lvl w:ilvl="8">
       <w:start w:val="1"/>
@@ -449,9 +426,131 @@
         </w:tabs>
         <w:ind w:start="3600" w:hanging="360"/>
       </w:pPr>
+      <w:rPr/>
     </w:lvl>
   </w:abstractNum>
   <w:abstractNum w:abstractNumId="2">
+    <w:lvl w:ilvl="0">
+      <w:start w:val="1"/>
+      <w:numFmt w:val="bullet"/>
+      <w:lvlText w:val=""/>
+      <w:lvlJc w:val="start"/>
+      <w:pPr>
+        <w:tabs>
+          <w:tab w:val="num" w:pos="0"/>
+        </w:tabs>
+        <w:ind w:start="720" w:hanging="360"/>
+      </w:pPr>
+      <w:rPr>
+        <w:rFonts w:ascii="Symbol" w:hAnsi="Symbol" w:cs="Symbol" w:hint="default"/>
+      </w:rPr>
+    </w:lvl>
+    <w:lvl w:ilvl="1">
+      <w:start w:val="1"/>
+      <w:numFmt w:val="decimal"/>
+      <w:lvlText w:val="%2."/>
+      <w:lvlJc w:val="start"/>
+      <w:pPr>
+        <w:tabs>
+          <w:tab w:val="num" w:pos="1080"/>
+        </w:tabs>
+        <w:ind w:start="1080" w:hanging="360"/>
+      </w:pPr>
+      <w:rPr/>
+    </w:lvl>
+    <w:lvl w:ilvl="2">
+      <w:start w:val="1"/>
+      <w:numFmt w:val="decimal"/>
+      <w:lvlText w:val="%3."/>
+      <w:lvlJc w:val="start"/>
+      <w:pPr>
+        <w:tabs>
+          <w:tab w:val="num" w:pos="1440"/>
+        </w:tabs>
+        <w:ind w:start="1440" w:hanging="360"/>
+      </w:pPr>
+      <w:rPr/>
+    </w:lvl>
+    <w:lvl w:ilvl="3">
+      <w:start w:val="1"/>
+      <w:numFmt w:val="decimal"/>
+      <w:lvlText w:val="%4."/>
+      <w:lvlJc w:val="start"/>
+      <w:pPr>
+        <w:tabs>
+          <w:tab w:val="num" w:pos="1800"/>
+        </w:tabs>
+        <w:ind w:start="1800" w:hanging="360"/>
+      </w:pPr>
+      <w:rPr/>
+    </w:lvl>
+    <w:lvl w:ilvl="4">
+      <w:start w:val="1"/>
+      <w:numFmt w:val="decimal"/>
+      <w:lvlText w:val="%5."/>
+      <w:lvlJc w:val="start"/>
+      <w:pPr>
+        <w:tabs>
+          <w:tab w:val="num" w:pos="2160"/>
+        </w:tabs>
+        <w:ind w:start="2160" w:hanging="360"/>
+      </w:pPr>
+      <w:rPr/>
+    </w:lvl>
+    <w:lvl w:ilvl="5">
+      <w:start w:val="1"/>
+      <w:numFmt w:val="decimal"/>
+      <w:lvlText w:val="%6."/>
+      <w:lvlJc w:val="start"/>
+      <w:pPr>
+        <w:tabs>
+          <w:tab w:val="num" w:pos="2520"/>
+        </w:tabs>
+        <w:ind w:start="2520" w:hanging="360"/>
+      </w:pPr>
+      <w:rPr/>
+    </w:lvl>
+    <w:lvl w:ilvl="6">
+      <w:start w:val="1"/>
+      <w:numFmt w:val="decimal"/>
+      <w:lvlText w:val="%7."/>
+      <w:lvlJc w:val="start"/>
+      <w:pPr>
+        <w:tabs>
+          <w:tab w:val="num" w:pos="2880"/>
+        </w:tabs>
+        <w:ind w:start="2880" w:hanging="360"/>
+      </w:pPr>
+      <w:rPr/>
+    </w:lvl>
+    <w:lvl w:ilvl="7">
+      <w:start w:val="1"/>
+      <w:numFmt w:val="decimal"/>
+      <w:lvlText w:val="%8."/>
+      <w:lvlJc w:val="start"/>
+      <w:pPr>
+        <w:tabs>
+          <w:tab w:val="num" w:pos="3240"/>
+        </w:tabs>
+        <w:ind w:start="3240" w:hanging="360"/>
+      </w:pPr>
+      <w:rPr/>
+    </w:lvl>
+    <w:lvl w:ilvl="8">
+      <w:start w:val="1"/>
+      <w:numFmt w:val="decimal"/>
+      <w:lvlText w:val="%9."/>
+      <w:lvlJc w:val="start"/>
+      <w:pPr>
+        <w:tabs>
+          <w:tab w:val="num" w:pos="3600"/>
+        </w:tabs>
+        <w:ind w:start="3600" w:hanging="360"/>
+      </w:pPr>
+      <w:rPr/>
+    </w:lvl>
+  </w:abstractNum>
+  <w:abstractNum w:abstractNumId="3">
     <w:lvl w:ilvl="0">
       <w:start w:val="1"/>
       <w:numFmt w:val="none"/>
@@ -577,7 +676,10 @@
     <w:abstractNumId w:val="2"/>
   </w:num>
   <w:num w:numId="3">
-    <w:abstractNumId w:val="1"/>
+    <w:abstractNumId w:val="3"/>
+  </w:num>
+  <w:num w:numId="4">
+    <w:abstractNumId w:val="2"/>
     <w:lvlOverride w:ilvl="0">
       <w:startOverride w:val="1"/>
     </w:lvlOverride>
@@ -607,6 +709,7 @@
     <w:qFormat/>
     <w:pPr>
       <w:widowControl/>
+      <w:suppressAutoHyphens w:val="true"/>
       <w:bidi w:val="0"/>
       <w:spacing w:before="0" w:after="0"/>
       <w:jc w:val="start"/>
@@ -703,11 +806,18 @@
       <w:u w:val="single"/>
     </w:rPr>
   </w:style>
-  <w:style w:type="character" w:styleId="FootnoteCharacters">
-    <w:name w:val="Footnote Characters"/>
+  <w:style w:type="character" w:styleId="FootnoteCharactersuser">
+    <w:name w:val="Footnote Characters (user)"/>
     <w:uiPriority w:val="99"/>
     <w:semiHidden/>
     <w:unhideWhenUsed/>
+    <w:qFormat/>
+    <w:rPr>
+      <w:vertAlign w:val="superscript"/>
+    </w:rPr>
+  </w:style>
+  <w:style w:type="character" w:styleId="FootnoteCharacters">
+    <w:name w:val="Footnote Characters"/>
     <w:qFormat/>
     <w:rPr>
       <w:vertAlign w:val="superscript"/>
@@ -731,11 +841,18 @@
       <w:szCs w:val="20"/>
     </w:rPr>
   </w:style>
-  <w:style w:type="character" w:styleId="EndnoteCharacters">
-    <w:name w:val="Endnote Characters"/>
+  <w:style w:type="character" w:styleId="EndnoteCharactersuser">
+    <w:name w:val="Endnote Characters (user)"/>
     <w:uiPriority w:val="99"/>
     <w:semiHidden/>
     <w:unhideWhenUsed/>
+    <w:qFormat/>
+    <w:rPr>
+      <w:vertAlign w:val="superscript"/>
+    </w:rPr>
+  </w:style>
+  <w:style w:type="character" w:styleId="EndnoteCharacters">
+    <w:name w:val="Endnote Characters"/>
     <w:qFormat/>
     <w:rPr>
       <w:vertAlign w:val="superscript"/>
@@ -832,6 +949,7 @@
     <w:qFormat/>
     <w:pPr>
       <w:widowControl/>
+      <w:suppressAutoHyphens w:val="true"/>
       <w:bidi w:val="0"/>
       <w:spacing w:before="0" w:after="0"/>
       <w:jc w:val="start"/>
@@ -852,6 +970,7 @@
     <w:qFormat/>
     <w:pPr>
       <w:widowControl/>
+      <w:suppressAutoHyphens w:val="true"/>
       <w:bidi w:val="0"/>
       <w:spacing w:before="0" w:after="0"/>
       <w:jc w:val="start"/>
@@ -906,37 +1025,37 @@
         <a:srgbClr val="000000"/>
       </a:dk1>
       <a:lt1>
-        <a:srgbClr val="ffffff"/>
+        <a:srgbClr val="FFFFFF"/>
       </a:lt1>
       <a:dk2>
         <a:srgbClr val="000000"/>
       </a:dk2>
       <a:lt2>
-        <a:srgbClr val="ffffff"/>
+        <a:srgbClr val="FFFFFF"/>
       </a:lt2>
       <a:accent1>
-        <a:srgbClr val="18a303"/>
+        <a:srgbClr val="18A303"/>
       </a:accent1>
       <a:accent2>
-        <a:srgbClr val="0369a3"/>
+        <a:srgbClr val="0369A3"/>
       </a:accent2>
       <a:accent3>
-        <a:srgbClr val="a33e03"/>
+        <a:srgbClr val="A33E03"/>
       </a:accent3>
       <a:accent4>
-        <a:srgbClr val="8e03a3"/>
+        <a:srgbClr val="8E03A3"/>
       </a:accent4>
       <a:accent5>
-        <a:srgbClr val="c99c00"/>
+        <a:srgbClr val="C99C00"/>
       </a:accent5>
       <a:accent6>
-        <a:srgbClr val="c9211e"/>
+        <a:srgbClr val="C9211E"/>
       </a:accent6>
       <a:hlink>
-        <a:srgbClr val="0000ee"/>
+        <a:srgbClr val="0000EE"/>
       </a:hlink>
       <a:folHlink>
-        <a:srgbClr val="551a8b"/>
+        <a:srgbClr val="551A8B"/>
       </a:folHlink>
     </a:clrScheme>
     <a:fontScheme name="Office">

</xml_diff>